<commit_message>
Arreglo de formato en tablas de plantilla_cotizacion
</commit_message>
<xml_diff>
--- a/MAQUIRENTAPP/app/src/main/assets/plantilla_cotizacion.docx
+++ b/MAQUIRENTAPP/app/src/main/assets/plantilla_cotizacion.docx
@@ -248,6 +248,13 @@
       <w:r>
         <w:t>Por la presente me es grato saludarlo a la vez, de acuerdo a lo conversado y con la intención de colaborar con el cumplimiento de sus metas le hago llegar una proforma de alquiler de equipos, en espera de llegar a un acuerdo comercial.</w:t>
       </w:r>
+    </w:p>
+    <w:p>
+      <w:pPr>
+        <w:spacing w:line="247" w:lineRule="auto"/>
+        <w:ind w:left="1052" w:right="1062" w:firstLine="599"/>
+        <w:jc w:val="both"/>
+      </w:pPr>
     </w:p>
     <w:p>
       <w:pPr>
@@ -259,137 +266,8 @@
     <w:tbl>
       <w:tblPr>
         <w:tblStyle w:val="TableNormal"/>
-        <w:tblpPr w:leftFromText="141" w:rightFromText="141" w:vertAnchor="text" w:horzAnchor="margin" w:tblpXSpec="center" w:tblpY="5735"/>
         <w:tblW w:w="0" w:type="auto"/>
-        <w:tblBorders>
-          <w:top w:val="single" w:sz="4" w:space="0" w:color="000000"/>
-          <w:left w:val="single" w:sz="4" w:space="0" w:color="000000"/>
-          <w:bottom w:val="single" w:sz="4" w:space="0" w:color="000000"/>
-          <w:right w:val="single" w:sz="4" w:space="0" w:color="000000"/>
-          <w:insideH w:val="single" w:sz="4" w:space="0" w:color="000000"/>
-          <w:insideV w:val="single" w:sz="4" w:space="0" w:color="000000"/>
-        </w:tblBorders>
-        <w:tblLayout w:type="fixed"/>
-        <w:tblLook w:val="01E0" w:firstRow="1" w:lastRow="1" w:firstColumn="1" w:lastColumn="1" w:noHBand="0" w:noVBand="0"/>
-      </w:tblPr>
-      <w:tblGrid>
-        <w:gridCol w:w="4086"/>
-        <w:gridCol w:w="4142"/>
-      </w:tblGrid>
-      <w:tr>
-        <w:trPr>
-          <w:trHeight w:val="621"/>
-        </w:trPr>
-        <w:tc>
-          <w:tcPr>
-            <w:tcW w:w="8228" w:type="dxa"/>
-            <w:gridSpan w:val="2"/>
-          </w:tcPr>
-          <w:p>
-            <w:pPr>
-              <w:pStyle w:val="TableParagraph"/>
-              <w:spacing w:before="169"/>
-              <w:ind w:left="3"/>
-              <w:jc w:val="center"/>
-            </w:pPr>
-            <w:r>
-              <w:t>Costo de hora</w:t>
-            </w:r>
-            <w:r>
-              <w:rPr>
-                <w:spacing w:val="-3"/>
-              </w:rPr>
-              <w:t xml:space="preserve"> </w:t>
-            </w:r>
-            <w:r>
-              <w:t>extra a</w:t>
-            </w:r>
-            <w:r>
-              <w:rPr>
-                <w:spacing w:val="-4"/>
-              </w:rPr>
-              <w:t xml:space="preserve"> </w:t>
-            </w:r>
-            <w:r>
-              <w:t>partir</w:t>
-            </w:r>
-            <w:r>
-              <w:rPr>
-                <w:spacing w:val="-3"/>
-              </w:rPr>
-              <w:t xml:space="preserve"> </w:t>
-            </w:r>
-            <w:r>
-              <w:t>de</w:t>
-            </w:r>
-            <w:r>
-              <w:rPr>
-                <w:spacing w:val="-3"/>
-              </w:rPr>
-              <w:t xml:space="preserve"> </w:t>
-            </w:r>
-            <w:r>
-              <w:t xml:space="preserve">200 </w:t>
-            </w:r>
-            <w:r>
-              <w:rPr>
-                <w:spacing w:val="-4"/>
-              </w:rPr>
-              <w:t>horas sin IGV</w:t>
-            </w:r>
-          </w:p>
-        </w:tc>
-      </w:tr>
-      <w:tr>
-        <w:trPr>
-          <w:trHeight w:val="621"/>
-        </w:trPr>
-        <w:tc>
-          <w:tcPr>
-            <w:tcW w:w="4086" w:type="dxa"/>
-          </w:tcPr>
-          <w:p>
-            <w:pPr>
-              <w:pStyle w:val="TableParagraph"/>
-              <w:spacing w:before="169"/>
-              <w:ind w:left="303"/>
-              <w:jc w:val="center"/>
-            </w:pPr>
-            <w:r>
-              <w:t>{{COD_GRUPO}}</w:t>
-            </w:r>
-          </w:p>
-        </w:tc>
-        <w:tc>
-          <w:tcPr>
-            <w:tcW w:w="4142" w:type="dxa"/>
-          </w:tcPr>
-          <w:p>
-            <w:pPr>
-              <w:pStyle w:val="TableParagraph"/>
-              <w:spacing w:before="169"/>
-              <w:ind w:left="3"/>
-              <w:jc w:val="center"/>
-            </w:pPr>
-            <w:r>
-              <w:t>{{PRECIO_HE}}</w:t>
-            </w:r>
-          </w:p>
-        </w:tc>
-      </w:tr>
-    </w:tbl>
-    <w:p>
-      <w:pPr>
-        <w:spacing w:line="247" w:lineRule="auto"/>
-        <w:ind w:left="1052" w:right="1062" w:firstLine="599"/>
-        <w:jc w:val="both"/>
-      </w:pPr>
-    </w:p>
-    <w:tbl>
-      <w:tblPr>
-        <w:tblStyle w:val="TableNormal"/>
-        <w:tblW w:w="0" w:type="auto"/>
-        <w:tblInd w:w="41" w:type="dxa"/>
+        <w:jc w:val="center"/>
         <w:tblBorders>
           <w:top w:val="single" w:sz="4" w:space="0" w:color="000000"/>
           <w:left w:val="single" w:sz="4" w:space="0" w:color="000000"/>
@@ -407,38 +285,23 @@
         <w:gridCol w:w="1442"/>
         <w:gridCol w:w="1440"/>
         <w:gridCol w:w="1710"/>
-        <w:gridCol w:w="1440"/>
-        <w:gridCol w:w="1890"/>
+        <w:gridCol w:w="1471"/>
+        <w:gridCol w:w="1350"/>
       </w:tblGrid>
       <w:tr>
         <w:trPr>
           <w:trHeight w:val="1494"/>
+          <w:jc w:val="center"/>
         </w:trPr>
         <w:tc>
           <w:tcPr>
             <w:tcW w:w="1820" w:type="dxa"/>
+            <w:vAlign w:val="center"/>
           </w:tcPr>
           <w:p>
             <w:pPr>
               <w:pStyle w:val="TableParagraph"/>
-              <w:rPr>
-                <w:sz w:val="20"/>
-              </w:rPr>
-            </w:pPr>
-          </w:p>
-          <w:p>
-            <w:pPr>
-              <w:pStyle w:val="TableParagraph"/>
-              <w:spacing w:before="36"/>
-              <w:rPr>
-                <w:sz w:val="20"/>
-              </w:rPr>
-            </w:pPr>
-          </w:p>
-          <w:p>
-            <w:pPr>
-              <w:pStyle w:val="TableParagraph"/>
-              <w:ind w:left="515"/>
+              <w:jc w:val="center"/>
               <w:rPr>
                 <w:b/>
                 <w:sz w:val="20"/>
@@ -457,27 +320,12 @@
         <w:tc>
           <w:tcPr>
             <w:tcW w:w="1472" w:type="dxa"/>
+            <w:vAlign w:val="center"/>
           </w:tcPr>
           <w:p>
             <w:pPr>
               <w:pStyle w:val="TableParagraph"/>
-              <w:rPr>
-                <w:sz w:val="20"/>
-              </w:rPr>
-            </w:pPr>
-          </w:p>
-          <w:p>
-            <w:pPr>
-              <w:pStyle w:val="TableParagraph"/>
-              <w:rPr>
-                <w:sz w:val="20"/>
-              </w:rPr>
-            </w:pPr>
-          </w:p>
-          <w:p>
-            <w:pPr>
-              <w:pStyle w:val="TableParagraph"/>
-              <w:ind w:left="98" w:right="8"/>
+              <w:ind w:right="8"/>
               <w:jc w:val="center"/>
               <w:rPr>
                 <w:b/>
@@ -497,29 +345,14 @@
         <w:tc>
           <w:tcPr>
             <w:tcW w:w="1442" w:type="dxa"/>
+            <w:vAlign w:val="center"/>
           </w:tcPr>
           <w:p>
             <w:pPr>
               <w:pStyle w:val="TableParagraph"/>
-              <w:rPr>
-                <w:sz w:val="20"/>
-              </w:rPr>
-            </w:pPr>
-          </w:p>
-          <w:p>
-            <w:pPr>
-              <w:pStyle w:val="TableParagraph"/>
-              <w:spacing w:before="36"/>
-              <w:rPr>
-                <w:sz w:val="20"/>
-              </w:rPr>
-            </w:pPr>
-          </w:p>
-          <w:p>
-            <w:pPr>
-              <w:pStyle w:val="TableParagraph"/>
               <w:spacing w:line="259" w:lineRule="auto"/>
-              <w:ind w:left="224" w:right="137" w:hanging="8"/>
+              <w:ind w:right="137"/>
+              <w:jc w:val="center"/>
               <w:rPr>
                 <w:b/>
                 <w:sz w:val="20"/>
@@ -554,28 +387,12 @@
         <w:tc>
           <w:tcPr>
             <w:tcW w:w="1440" w:type="dxa"/>
+            <w:vAlign w:val="center"/>
           </w:tcPr>
           <w:p>
             <w:pPr>
               <w:pStyle w:val="TableParagraph"/>
-              <w:rPr>
-                <w:sz w:val="20"/>
-              </w:rPr>
-            </w:pPr>
-          </w:p>
-          <w:p>
-            <w:pPr>
-              <w:pStyle w:val="TableParagraph"/>
-              <w:spacing w:before="36"/>
-              <w:rPr>
-                <w:sz w:val="20"/>
-              </w:rPr>
-            </w:pPr>
-          </w:p>
-          <w:p>
-            <w:pPr>
-              <w:pStyle w:val="TableParagraph"/>
-              <w:ind w:left="301"/>
+              <w:jc w:val="center"/>
               <w:rPr>
                 <w:b/>
                 <w:sz w:val="20"/>
@@ -594,28 +411,12 @@
         <w:tc>
           <w:tcPr>
             <w:tcW w:w="1710" w:type="dxa"/>
+            <w:vAlign w:val="center"/>
           </w:tcPr>
           <w:p>
             <w:pPr>
               <w:pStyle w:val="TableParagraph"/>
-              <w:rPr>
-                <w:sz w:val="20"/>
-              </w:rPr>
-            </w:pPr>
-          </w:p>
-          <w:p>
-            <w:pPr>
-              <w:pStyle w:val="TableParagraph"/>
-              <w:spacing w:before="36"/>
-              <w:rPr>
-                <w:sz w:val="20"/>
-              </w:rPr>
-            </w:pPr>
-          </w:p>
-          <w:p>
-            <w:pPr>
-              <w:pStyle w:val="TableParagraph"/>
-              <w:ind w:left="289"/>
+              <w:jc w:val="center"/>
               <w:rPr>
                 <w:b/>
                 <w:sz w:val="20"/>
@@ -633,22 +434,14 @@
         </w:tc>
         <w:tc>
           <w:tcPr>
-            <w:tcW w:w="1440" w:type="dxa"/>
+            <w:tcW w:w="1471" w:type="dxa"/>
+            <w:vAlign w:val="center"/>
           </w:tcPr>
           <w:p>
             <w:pPr>
               <w:pStyle w:val="TableParagraph"/>
-              <w:spacing w:before="18"/>
-              <w:rPr>
-                <w:sz w:val="20"/>
-              </w:rPr>
-            </w:pPr>
-          </w:p>
-          <w:p>
-            <w:pPr>
-              <w:pStyle w:val="TableParagraph"/>
               <w:spacing w:line="259" w:lineRule="auto"/>
-              <w:ind w:left="222" w:right="132" w:hanging="3"/>
+              <w:ind w:right="132"/>
               <w:jc w:val="center"/>
               <w:rPr>
                 <w:b/>
@@ -683,15 +476,7 @@
                 <w:b/>
                 <w:sz w:val="20"/>
               </w:rPr>
-              <w:t>MES PARCIAL US$</w:t>
-            </w:r>
-            <w:r>
-              <w:rPr>
-                <w:b/>
-                <w:spacing w:val="-13"/>
-                <w:sz w:val="20"/>
-              </w:rPr>
-              <w:t xml:space="preserve"> </w:t>
+              <w:t>MES PARCIAL</w:t>
             </w:r>
           </w:p>
           <w:p>
@@ -709,13 +494,14 @@
         </w:tc>
         <w:tc>
           <w:tcPr>
-            <w:tcW w:w="1890" w:type="dxa"/>
+            <w:tcW w:w="1350" w:type="dxa"/>
+            <w:vAlign w:val="center"/>
           </w:tcPr>
           <w:p>
             <w:pPr>
               <w:pStyle w:val="TableParagraph"/>
               <w:spacing w:before="228"/>
-              <w:ind w:left="238" w:right="138" w:hanging="3"/>
+              <w:ind w:right="138"/>
               <w:jc w:val="center"/>
               <w:rPr>
                 <w:b/>
@@ -735,7 +521,14 @@
                 <w:b/>
                 <w:sz w:val="20"/>
               </w:rPr>
-              <w:t xml:space="preserve">POR MES US$ – </w:t>
+              <w:t>POR MES</w:t>
+            </w:r>
+            <w:r>
+              <w:rPr>
+                <w:b/>
+                <w:sz w:val="20"/>
+              </w:rPr>
+              <w:t xml:space="preserve"> </w:t>
             </w:r>
             <w:r>
               <w:rPr>
@@ -751,6 +544,7 @@
       <w:tr>
         <w:trPr>
           <w:trHeight w:val="2286"/>
+          <w:jc w:val="center"/>
         </w:trPr>
         <w:tc>
           <w:tcPr>
@@ -865,7 +659,7 @@
         </w:tc>
         <w:tc>
           <w:tcPr>
-            <w:tcW w:w="1440" w:type="dxa"/>
+            <w:tcW w:w="1471" w:type="dxa"/>
             <w:vAlign w:val="center"/>
           </w:tcPr>
           <w:p>
@@ -884,7 +678,7 @@
         </w:tc>
         <w:tc>
           <w:tcPr>
-            <w:tcW w:w="1890" w:type="dxa"/>
+            <w:tcW w:w="1350" w:type="dxa"/>
             <w:vAlign w:val="center"/>
           </w:tcPr>
           <w:p>
@@ -902,6 +696,7 @@
       <w:tr>
         <w:trPr>
           <w:trHeight w:val="263"/>
+          <w:jc w:val="center"/>
         </w:trPr>
         <w:tc>
           <w:tcPr>
@@ -923,7 +718,7 @@
         </w:tc>
         <w:tc>
           <w:tcPr>
-            <w:tcW w:w="1440" w:type="dxa"/>
+            <w:tcW w:w="1471" w:type="dxa"/>
             <w:vAlign w:val="center"/>
           </w:tcPr>
           <w:p>
@@ -938,7 +733,7 @@
         </w:tc>
         <w:tc>
           <w:tcPr>
-            <w:tcW w:w="1890" w:type="dxa"/>
+            <w:tcW w:w="1350" w:type="dxa"/>
             <w:vAlign w:val="center"/>
           </w:tcPr>
           <w:p>
@@ -956,29 +751,197 @@
     <w:p>
       <w:pPr>
         <w:pStyle w:val="TableParagraph"/>
-        <w:jc w:val="right"/>
-        <w:sectPr>
-          <w:headerReference w:type="default" r:id="rId7"/>
-          <w:type w:val="continuous"/>
-          <w:pgSz w:w="12240" w:h="15840"/>
-          <w:pgMar w:top="2040" w:right="360" w:bottom="280" w:left="360" w:header="759" w:footer="0" w:gutter="0"/>
-          <w:pgNumType w:start="1"/>
-          <w:cols w:space="720"/>
-        </w:sectPr>
+        <w:tabs>
+          <w:tab w:val="left" w:pos="720"/>
+          <w:tab w:val="left" w:pos="1440"/>
+          <w:tab w:val="left" w:pos="2160"/>
+          <w:tab w:val="left" w:pos="2880"/>
+          <w:tab w:val="left" w:pos="3600"/>
+          <w:tab w:val="left" w:pos="4320"/>
+          <w:tab w:val="left" w:pos="5040"/>
+          <w:tab w:val="center" w:pos="5760"/>
+          <w:tab w:val="left" w:pos="6876"/>
+        </w:tabs>
       </w:pPr>
     </w:p>
     <w:p>
       <w:pPr>
-        <w:pStyle w:val="Textoindependiente"/>
-        <w:spacing w:before="42"/>
+        <w:pStyle w:val="TableParagraph"/>
+        <w:tabs>
+          <w:tab w:val="left" w:pos="720"/>
+          <w:tab w:val="left" w:pos="1440"/>
+          <w:tab w:val="left" w:pos="2160"/>
+          <w:tab w:val="left" w:pos="2880"/>
+          <w:tab w:val="left" w:pos="3600"/>
+          <w:tab w:val="left" w:pos="4320"/>
+          <w:tab w:val="left" w:pos="5040"/>
+          <w:tab w:val="center" w:pos="5760"/>
+          <w:tab w:val="left" w:pos="6876"/>
+        </w:tabs>
       </w:pPr>
     </w:p>
     <w:p>
       <w:pPr>
-        <w:pStyle w:val="Textoindependiente"/>
-        <w:spacing w:before="217"/>
+        <w:pStyle w:val="TableParagraph"/>
+        <w:tabs>
+          <w:tab w:val="left" w:pos="720"/>
+          <w:tab w:val="left" w:pos="1440"/>
+          <w:tab w:val="left" w:pos="2160"/>
+          <w:tab w:val="left" w:pos="2880"/>
+          <w:tab w:val="left" w:pos="3600"/>
+          <w:tab w:val="left" w:pos="4320"/>
+          <w:tab w:val="left" w:pos="5040"/>
+          <w:tab w:val="center" w:pos="5760"/>
+          <w:tab w:val="left" w:pos="6876"/>
+        </w:tabs>
       </w:pPr>
     </w:p>
+    <w:p>
+      <w:pPr>
+        <w:pStyle w:val="TableParagraph"/>
+        <w:tabs>
+          <w:tab w:val="left" w:pos="720"/>
+          <w:tab w:val="left" w:pos="1440"/>
+          <w:tab w:val="left" w:pos="2160"/>
+          <w:tab w:val="left" w:pos="2880"/>
+          <w:tab w:val="left" w:pos="3600"/>
+          <w:tab w:val="left" w:pos="4320"/>
+          <w:tab w:val="left" w:pos="5040"/>
+          <w:tab w:val="center" w:pos="5760"/>
+          <w:tab w:val="left" w:pos="6876"/>
+        </w:tabs>
+      </w:pPr>
+      <w:r>
+        <w:tab/>
+      </w:r>
+      <w:r>
+        <w:tab/>
+      </w:r>
+    </w:p>
+    <w:tbl>
+      <w:tblPr>
+        <w:tblStyle w:val="TableNormal"/>
+        <w:tblW w:w="0" w:type="auto"/>
+        <w:jc w:val="center"/>
+        <w:tblBorders>
+          <w:top w:val="single" w:sz="4" w:space="0" w:color="000000"/>
+          <w:left w:val="single" w:sz="4" w:space="0" w:color="000000"/>
+          <w:bottom w:val="single" w:sz="4" w:space="0" w:color="000000"/>
+          <w:right w:val="single" w:sz="4" w:space="0" w:color="000000"/>
+          <w:insideH w:val="single" w:sz="4" w:space="0" w:color="000000"/>
+          <w:insideV w:val="single" w:sz="4" w:space="0" w:color="000000"/>
+        </w:tblBorders>
+        <w:tblLayout w:type="fixed"/>
+        <w:tblLook w:val="01E0" w:firstRow="1" w:lastRow="1" w:firstColumn="1" w:lastColumn="1" w:noHBand="0" w:noVBand="0"/>
+      </w:tblPr>
+      <w:tblGrid>
+        <w:gridCol w:w="4086"/>
+        <w:gridCol w:w="4142"/>
+      </w:tblGrid>
+      <w:tr>
+        <w:trPr>
+          <w:trHeight w:val="621"/>
+          <w:jc w:val="center"/>
+        </w:trPr>
+        <w:tc>
+          <w:tcPr>
+            <w:tcW w:w="8228" w:type="dxa"/>
+            <w:gridSpan w:val="2"/>
+          </w:tcPr>
+          <w:p>
+            <w:pPr>
+              <w:pStyle w:val="TableParagraph"/>
+              <w:spacing w:before="169"/>
+              <w:ind w:left="3"/>
+              <w:jc w:val="center"/>
+            </w:pPr>
+            <w:r>
+              <w:t>Costo de hora</w:t>
+            </w:r>
+            <w:r>
+              <w:rPr>
+                <w:spacing w:val="-3"/>
+              </w:rPr>
+              <w:t xml:space="preserve"> </w:t>
+            </w:r>
+            <w:r>
+              <w:t>extra a</w:t>
+            </w:r>
+            <w:r>
+              <w:rPr>
+                <w:spacing w:val="-4"/>
+              </w:rPr>
+              <w:t xml:space="preserve"> </w:t>
+            </w:r>
+            <w:r>
+              <w:t>partir</w:t>
+            </w:r>
+            <w:r>
+              <w:rPr>
+                <w:spacing w:val="-3"/>
+              </w:rPr>
+              <w:t xml:space="preserve"> </w:t>
+            </w:r>
+            <w:r>
+              <w:t>de</w:t>
+            </w:r>
+            <w:r>
+              <w:rPr>
+                <w:spacing w:val="-3"/>
+              </w:rPr>
+              <w:t xml:space="preserve"> </w:t>
+            </w:r>
+            <w:r>
+              <w:t xml:space="preserve">200 </w:t>
+            </w:r>
+            <w:r>
+              <w:rPr>
+                <w:spacing w:val="-4"/>
+              </w:rPr>
+              <w:t>horas sin IGV</w:t>
+            </w:r>
+          </w:p>
+        </w:tc>
+      </w:tr>
+      <w:tr>
+        <w:trPr>
+          <w:trHeight w:val="621"/>
+          <w:jc w:val="center"/>
+        </w:trPr>
+        <w:tc>
+          <w:tcPr>
+            <w:tcW w:w="4086" w:type="dxa"/>
+          </w:tcPr>
+          <w:p>
+            <w:pPr>
+              <w:pStyle w:val="TableParagraph"/>
+              <w:spacing w:before="169"/>
+              <w:ind w:left="303"/>
+              <w:jc w:val="center"/>
+            </w:pPr>
+            <w:r>
+              <w:t>{{COD_GRUPO}}</w:t>
+            </w:r>
+          </w:p>
+        </w:tc>
+        <w:tc>
+          <w:tcPr>
+            <w:tcW w:w="4142" w:type="dxa"/>
+          </w:tcPr>
+          <w:p>
+            <w:pPr>
+              <w:pStyle w:val="TableParagraph"/>
+              <w:spacing w:before="169"/>
+              <w:ind w:left="3"/>
+              <w:jc w:val="center"/>
+            </w:pPr>
+            <w:r>
+              <w:t>{{PRECIO_HE}}</w:t>
+            </w:r>
+          </w:p>
+        </w:tc>
+      </w:tr>
+    </w:tbl>
     <w:p>
       <w:pPr>
         <w:pStyle w:val="Textoindependiente"/>
@@ -1524,7 +1487,14 @@
         <w:rPr>
           <w:sz w:val="20"/>
         </w:rPr>
-        <w:t>EN CASO DE PRESENTARSE CUALQUIER DAÑO, EL CLIENTE SE HARÁ RESPONSABLE DE LAS REPARACIONES, SEGÚN LOS CARGOS POR DAÑOS VIGENTES A LA DEVOLUCIÓN.</w:t>
+        <w:t xml:space="preserve">EN CASO DE PRESENTARSE CUALQUIER DAÑO, EL CLIENTE SE HARÁ RESPONSABLE DE LAS </w:t>
+      </w:r>
+      <w:r>
+        <w:rPr>
+          <w:sz w:val="20"/>
+        </w:rPr>
+        <w:lastRenderedPageBreak/>
+        <w:t>REPARACIONES, SEGÚN LOS CARGOS POR DAÑOS VIGENTES A LA DEVOLUCIÓN.</w:t>
       </w:r>
     </w:p>
     <w:p>
@@ -1965,7 +1935,7 @@
       </w:pPr>
     </w:p>
     <w:sectPr>
-      <w:headerReference w:type="default" r:id="rId8"/>
+      <w:headerReference w:type="default" r:id="rId7"/>
       <w:pgSz w:w="12240" w:h="15840"/>
       <w:pgMar w:top="2040" w:right="360" w:bottom="280" w:left="360" w:header="759" w:footer="0" w:gutter="0"/>
       <w:cols w:space="720"/>
@@ -2013,1242 +1983,6 @@
 </file>
 
 <file path=word/header1.xml><?xml version="1.0" encoding="utf-8"?>
-<w:hdr xmlns:wpc="http://schemas.microsoft.com/office/word/2010/wordprocessingCanvas" xmlns:cx="http://schemas.microsoft.com/office/drawing/2014/chartex" xmlns:cx1="http://schemas.microsoft.com/office/drawing/2015/9/8/chartex" xmlns:cx2="http://schemas.microsoft.com/office/drawing/2015/10/21/chartex" xmlns:cx3="http://schemas.microsoft.com/office/drawing/2016/5/9/chartex" xmlns:cx4="http://schemas.microsoft.com/office/drawing/2016/5/10/chartex" xmlns:cx5="http://schemas.microsoft.com/office/drawing/2016/5/11/chartex" xmlns:cx6="http://schemas.microsoft.com/office/drawing/2016/5/12/chartex" xmlns:cx7="http://schemas.microsoft.com/office/drawing/2016/5/13/chartex" xmlns:cx8="http://schemas.microsoft.com/office/drawing/2016/5/14/chartex" xmlns:mc="http://schemas.openxmlformats.org/markup-compatibility/2006" xmlns:aink="http://schemas.microsoft.com/office/drawing/2016/ink" xmlns:am3d="http://schemas.microsoft.com/office/drawing/2017/model3d" xmlns:o="urn:schemas-microsoft-com:office:office" xmlns:oel="http://schemas.microsoft.com/office/2019/extlst" xmlns:r="http://schemas.openxmlformats.org/officeDocument/2006/relationships" xmlns:m="http://schemas.openxmlformats.org/officeDocument/2006/math" xmlns:v="urn:schemas-microsoft-com:vml" xmlns:wp14="http://schemas.microsoft.com/office/word/2010/wordprocessingDrawing" xmlns:wp="http://schemas.openxmlformats.org/drawingml/2006/wordprocessingDrawing" xmlns:w10="urn:schemas-microsoft-com:office:word" xmlns:w="http://schemas.openxmlformats.org/wordprocessingml/2006/main" xmlns:w14="http://schemas.microsoft.com/office/word/2010/wordml" xmlns:w15="http://schemas.microsoft.com/office/word/2012/wordml" xmlns:w16cex="http://schemas.microsoft.com/office/word/2018/wordml/cex" xmlns:w16cid="http://schemas.microsoft.com/office/word/2016/wordml/cid" xmlns:w16="http://schemas.microsoft.com/office/word/2018/wordml" xmlns:w16sdtdh="http://schemas.microsoft.com/office/word/2020/wordml/sdtdatahash" xmlns:w16se="http://schemas.microsoft.com/office/word/2015/wordml/symex" xmlns:wpg="http://schemas.microsoft.com/office/word/2010/wordprocessingGroup" xmlns:wpi="http://schemas.microsoft.com/office/word/2010/wordprocessingInk" xmlns:wne="http://schemas.microsoft.com/office/word/2006/wordml" xmlns:wps="http://schemas.microsoft.com/office/word/2010/wordprocessingShape" mc:Ignorable="w14 w15 w16se w16cid w16 w16cex w16sdtdh wp14">
-  <w:p>
-    <w:pPr>
-      <w:pStyle w:val="Textoindependiente"/>
-      <w:spacing w:line="14" w:lineRule="auto"/>
-    </w:pPr>
-    <w:r>
-      <w:rPr>
-        <w:noProof/>
-      </w:rPr>
-      <mc:AlternateContent>
-        <mc:Choice Requires="wps">
-          <w:drawing>
-            <wp:anchor distT="0" distB="0" distL="0" distR="0" simplePos="0" relativeHeight="251655680" behindDoc="1" locked="0" layoutInCell="1" allowOverlap="1" wp14:anchorId="51082E9E" wp14:editId="41F14E8C">
-              <wp:simplePos x="0" y="0"/>
-              <wp:positionH relativeFrom="page">
-                <wp:posOffset>896619</wp:posOffset>
-              </wp:positionH>
-              <wp:positionV relativeFrom="page">
-                <wp:posOffset>1282700</wp:posOffset>
-              </wp:positionV>
-              <wp:extent cx="5610860" cy="15240"/>
-              <wp:effectExtent l="0" t="0" r="0" b="0"/>
-              <wp:wrapNone/>
-              <wp:docPr id="1" name="Graphic 1"/>
-              <wp:cNvGraphicFramePr>
-                <a:graphicFrameLocks xmlns:a="http://schemas.openxmlformats.org/drawingml/2006/main"/>
-              </wp:cNvGraphicFramePr>
-              <a:graphic xmlns:a="http://schemas.openxmlformats.org/drawingml/2006/main">
-                <a:graphicData uri="http://schemas.microsoft.com/office/word/2010/wordprocessingShape">
-                  <wps:wsp>
-                    <wps:cNvSpPr>
-                      <a:spLocks/>
-                    </wps:cNvSpPr>
-                    <wps:spPr>
-                      <a:xfrm>
-                        <a:off x="0" y="0"/>
-                        <a:ext cx="5610860" cy="15240"/>
-                      </a:xfrm>
-                      <a:custGeom>
-                        <a:avLst/>
-                        <a:gdLst/>
-                        <a:ahLst/>
-                        <a:cxnLst/>
-                        <a:rect l="l" t="t" r="r" b="b"/>
-                        <a:pathLst>
-                          <a:path w="5610860" h="15240">
-                            <a:moveTo>
-                              <a:pt x="5610733" y="0"/>
-                            </a:moveTo>
-                            <a:lnTo>
-                              <a:pt x="0" y="0"/>
-                            </a:lnTo>
-                            <a:lnTo>
-                              <a:pt x="0" y="15240"/>
-                            </a:lnTo>
-                            <a:lnTo>
-                              <a:pt x="5610733" y="15240"/>
-                            </a:lnTo>
-                            <a:lnTo>
-                              <a:pt x="5610733" y="0"/>
-                            </a:lnTo>
-                            <a:close/>
-                          </a:path>
-                        </a:pathLst>
-                      </a:custGeom>
-                      <a:solidFill>
-                        <a:srgbClr val="000000"/>
-                      </a:solidFill>
-                    </wps:spPr>
-                    <wps:bodyPr wrap="square" lIns="0" tIns="0" rIns="0" bIns="0" rtlCol="0">
-                      <a:prstTxWarp prst="textNoShape">
-                        <a:avLst/>
-                      </a:prstTxWarp>
-                      <a:noAutofit/>
-                    </wps:bodyPr>
-                  </wps:wsp>
-                </a:graphicData>
-              </a:graphic>
-            </wp:anchor>
-          </w:drawing>
-        </mc:Choice>
-        <mc:Fallback>
-          <w:pict>
-            <v:shape w14:anchorId="402AE24A" id="Graphic 1" o:spid="_x0000_s1026" style="position:absolute;margin-left:70.6pt;margin-top:101pt;width:441.8pt;height:1.2pt;z-index:-251660800;visibility:visible;mso-wrap-style:square;mso-wrap-distance-left:0;mso-wrap-distance-top:0;mso-wrap-distance-right:0;mso-wrap-distance-bottom:0;mso-position-horizontal:absolute;mso-position-horizontal-relative:page;mso-position-vertical:absolute;mso-position-vertical-relative:page;v-text-anchor:top" coordsize="5610860,15240" o:gfxdata="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" path="m5610733,l,,,15240r5610733,l5610733,xe" fillcolor="black" stroked="f">
-              <v:path arrowok="t"/>
-              <w10:wrap anchorx="page" anchory="page"/>
-            </v:shape>
-          </w:pict>
-        </mc:Fallback>
-      </mc:AlternateContent>
-    </w:r>
-    <w:r>
-      <w:rPr>
-        <w:noProof/>
-      </w:rPr>
-      <mc:AlternateContent>
-        <mc:Choice Requires="wps">
-          <w:drawing>
-            <wp:anchor distT="0" distB="0" distL="0" distR="0" simplePos="0" relativeHeight="251657728" behindDoc="1" locked="0" layoutInCell="1" allowOverlap="1" wp14:anchorId="615F20F5" wp14:editId="19803784">
-              <wp:simplePos x="0" y="0"/>
-              <wp:positionH relativeFrom="page">
-                <wp:posOffset>886777</wp:posOffset>
-              </wp:positionH>
-              <wp:positionV relativeFrom="page">
-                <wp:posOffset>469265</wp:posOffset>
-              </wp:positionV>
-              <wp:extent cx="2083435" cy="328295"/>
-              <wp:effectExtent l="0" t="0" r="0" b="0"/>
-              <wp:wrapNone/>
-              <wp:docPr id="2" name="Textbox 2"/>
-              <wp:cNvGraphicFramePr>
-                <a:graphicFrameLocks xmlns:a="http://schemas.openxmlformats.org/drawingml/2006/main"/>
-              </wp:cNvGraphicFramePr>
-              <a:graphic xmlns:a="http://schemas.openxmlformats.org/drawingml/2006/main">
-                <a:graphicData uri="http://schemas.microsoft.com/office/word/2010/wordprocessingShape">
-                  <wps:wsp>
-                    <wps:cNvSpPr txBox="1">
-                      <a:spLocks/>
-                    </wps:cNvSpPr>
-                    <wps:spPr>
-                      <a:xfrm>
-                        <a:off x="0" y="0"/>
-                        <a:ext cx="2083435" cy="328295"/>
-                      </a:xfrm>
-                      <a:prstGeom prst="rect">
-                        <a:avLst/>
-                      </a:prstGeom>
-                    </wps:spPr>
-                    <wps:txbx>
-                      <w:txbxContent>
-                        <w:p>
-                          <w:pPr>
-                            <w:spacing w:line="238" w:lineRule="exact"/>
-                            <w:ind w:left="20"/>
-                            <w:rPr>
-                              <w:rFonts w:ascii="Calibri"/>
-                              <w:b/>
-                            </w:rPr>
-                          </w:pPr>
-                          <w:r>
-                            <w:rPr>
-                              <w:rFonts w:ascii="Calibri"/>
-                              <w:b/>
-                              <w:color w:val="FF0000"/>
-                              <w:u w:val="single" w:color="000000"/>
-                            </w:rPr>
-                            <w:t>MAQUI</w:t>
-                          </w:r>
-                          <w:r>
-                            <w:rPr>
-                              <w:rFonts w:ascii="Calibri"/>
-                              <w:b/>
-                              <w:color w:val="006EC0"/>
-                              <w:u w:val="single" w:color="000000"/>
-                            </w:rPr>
-                            <w:t>RENT</w:t>
-                          </w:r>
-                          <w:r>
-                            <w:rPr>
-                              <w:rFonts w:ascii="Calibri"/>
-                              <w:b/>
-                              <w:color w:val="006EC0"/>
-                              <w:spacing w:val="-4"/>
-                              <w:u w:val="single" w:color="000000"/>
-                            </w:rPr>
-                            <w:t xml:space="preserve"> </w:t>
-                          </w:r>
-                          <w:r>
-                            <w:rPr>
-                              <w:rFonts w:ascii="Calibri"/>
-                              <w:b/>
-                              <w:u w:val="single"/>
-                            </w:rPr>
-                            <w:t>SERVICIOS</w:t>
-                          </w:r>
-                          <w:r>
-                            <w:rPr>
-                              <w:rFonts w:ascii="Calibri"/>
-                              <w:b/>
-                              <w:spacing w:val="-5"/>
-                              <w:u w:val="single"/>
-                            </w:rPr>
-                            <w:t xml:space="preserve"> </w:t>
-                          </w:r>
-                          <w:r>
-                            <w:rPr>
-                              <w:rFonts w:ascii="Calibri"/>
-                              <w:b/>
-                              <w:spacing w:val="-2"/>
-                              <w:u w:val="single"/>
-                            </w:rPr>
-                            <w:t>GENERALES</w:t>
-                          </w:r>
-                        </w:p>
-                        <w:p>
-                          <w:pPr>
-                            <w:spacing w:line="263" w:lineRule="exact"/>
-                            <w:ind w:left="71"/>
-                            <w:rPr>
-                              <w:rFonts w:ascii="Calibri"/>
-                              <w:b/>
-                            </w:rPr>
-                          </w:pPr>
-                          <w:r>
-                            <w:rPr>
-                              <w:rFonts w:ascii="Calibri"/>
-                              <w:b/>
-                            </w:rPr>
-                            <w:t>HUGO</w:t>
-                          </w:r>
-                          <w:r>
-                            <w:rPr>
-                              <w:rFonts w:ascii="Calibri"/>
-                              <w:b/>
-                              <w:spacing w:val="-8"/>
-                            </w:rPr>
-                            <w:t xml:space="preserve"> </w:t>
-                          </w:r>
-                          <w:r>
-                            <w:rPr>
-                              <w:rFonts w:ascii="Calibri"/>
-                              <w:b/>
-                            </w:rPr>
-                            <w:t>ALBERTO</w:t>
-                          </w:r>
-                          <w:r>
-                            <w:rPr>
-                              <w:rFonts w:ascii="Calibri"/>
-                              <w:b/>
-                              <w:spacing w:val="-7"/>
-                            </w:rPr>
-                            <w:t xml:space="preserve"> </w:t>
-                          </w:r>
-                          <w:r>
-                            <w:rPr>
-                              <w:rFonts w:ascii="Calibri"/>
-                              <w:b/>
-                            </w:rPr>
-                            <w:t>ESQUIVEL</w:t>
-                          </w:r>
-                          <w:r>
-                            <w:rPr>
-                              <w:rFonts w:ascii="Calibri"/>
-                              <w:b/>
-                              <w:spacing w:val="-7"/>
-                            </w:rPr>
-                            <w:t xml:space="preserve"> </w:t>
-                          </w:r>
-                          <w:r>
-                            <w:rPr>
-                              <w:rFonts w:ascii="Calibri"/>
-                              <w:b/>
-                              <w:spacing w:val="-4"/>
-                            </w:rPr>
-                            <w:t>PANDO</w:t>
-                          </w:r>
-                        </w:p>
-                      </w:txbxContent>
-                    </wps:txbx>
-                    <wps:bodyPr wrap="square" lIns="0" tIns="0" rIns="0" bIns="0" rtlCol="0">
-                      <a:noAutofit/>
-                    </wps:bodyPr>
-                  </wps:wsp>
-                </a:graphicData>
-              </a:graphic>
-            </wp:anchor>
-          </w:drawing>
-        </mc:Choice>
-        <mc:Fallback>
-          <w:pict>
-            <v:shapetype w14:anchorId="615F20F5" id="_x0000_t202" coordsize="21600,21600" o:spt="202" path="m,l,21600r21600,l21600,xe">
-              <v:stroke joinstyle="miter"/>
-              <v:path gradientshapeok="t" o:connecttype="rect"/>
-            </v:shapetype>
-            <v:shape id="Textbox 2" o:spid="_x0000_s1026" type="#_x0000_t202" style="position:absolute;margin-left:69.8pt;margin-top:36.95pt;width:164.05pt;height:25.85pt;z-index:-251658752;visibility:visible;mso-wrap-style:square;mso-wrap-distance-left:0;mso-wrap-distance-top:0;mso-wrap-distance-right:0;mso-wrap-distance-bottom:0;mso-position-horizontal:absolute;mso-position-horizontal-relative:page;mso-position-vertical:absolute;mso-position-vertical-relative:page;v-text-anchor:top" o:gfxdata="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" filled="f" stroked="f">
-              <v:textbox inset="0,0,0,0">
-                <w:txbxContent>
-                  <w:p>
-                    <w:pPr>
-                      <w:spacing w:line="238" w:lineRule="exact"/>
-                      <w:ind w:left="20"/>
-                      <w:rPr>
-                        <w:rFonts w:ascii="Calibri"/>
-                        <w:b/>
-                      </w:rPr>
-                    </w:pPr>
-                    <w:r>
-                      <w:rPr>
-                        <w:rFonts w:ascii="Calibri"/>
-                        <w:b/>
-                        <w:color w:val="FF0000"/>
-                        <w:u w:val="single" w:color="000000"/>
-                      </w:rPr>
-                      <w:t>MAQUI</w:t>
-                    </w:r>
-                    <w:r>
-                      <w:rPr>
-                        <w:rFonts w:ascii="Calibri"/>
-                        <w:b/>
-                        <w:color w:val="006EC0"/>
-                        <w:u w:val="single" w:color="000000"/>
-                      </w:rPr>
-                      <w:t>RENT</w:t>
-                    </w:r>
-                    <w:r>
-                      <w:rPr>
-                        <w:rFonts w:ascii="Calibri"/>
-                        <w:b/>
-                        <w:color w:val="006EC0"/>
-                        <w:spacing w:val="-4"/>
-                        <w:u w:val="single" w:color="000000"/>
-                      </w:rPr>
-                      <w:t xml:space="preserve"> </w:t>
-                    </w:r>
-                    <w:r>
-                      <w:rPr>
-                        <w:rFonts w:ascii="Calibri"/>
-                        <w:b/>
-                        <w:u w:val="single"/>
-                      </w:rPr>
-                      <w:t>SERVICIOS</w:t>
-                    </w:r>
-                    <w:r>
-                      <w:rPr>
-                        <w:rFonts w:ascii="Calibri"/>
-                        <w:b/>
-                        <w:spacing w:val="-5"/>
-                        <w:u w:val="single"/>
-                      </w:rPr>
-                      <w:t xml:space="preserve"> </w:t>
-                    </w:r>
-                    <w:r>
-                      <w:rPr>
-                        <w:rFonts w:ascii="Calibri"/>
-                        <w:b/>
-                        <w:spacing w:val="-2"/>
-                        <w:u w:val="single"/>
-                      </w:rPr>
-                      <w:t>GENERALES</w:t>
-                    </w:r>
-                  </w:p>
-                  <w:p>
-                    <w:pPr>
-                      <w:spacing w:line="263" w:lineRule="exact"/>
-                      <w:ind w:left="71"/>
-                      <w:rPr>
-                        <w:rFonts w:ascii="Calibri"/>
-                        <w:b/>
-                      </w:rPr>
-                    </w:pPr>
-                    <w:r>
-                      <w:rPr>
-                        <w:rFonts w:ascii="Calibri"/>
-                        <w:b/>
-                      </w:rPr>
-                      <w:t>HUGO</w:t>
-                    </w:r>
-                    <w:r>
-                      <w:rPr>
-                        <w:rFonts w:ascii="Calibri"/>
-                        <w:b/>
-                        <w:spacing w:val="-8"/>
-                      </w:rPr>
-                      <w:t xml:space="preserve"> </w:t>
-                    </w:r>
-                    <w:r>
-                      <w:rPr>
-                        <w:rFonts w:ascii="Calibri"/>
-                        <w:b/>
-                      </w:rPr>
-                      <w:t>ALBERTO</w:t>
-                    </w:r>
-                    <w:r>
-                      <w:rPr>
-                        <w:rFonts w:ascii="Calibri"/>
-                        <w:b/>
-                        <w:spacing w:val="-7"/>
-                      </w:rPr>
-                      <w:t xml:space="preserve"> </w:t>
-                    </w:r>
-                    <w:r>
-                      <w:rPr>
-                        <w:rFonts w:ascii="Calibri"/>
-                        <w:b/>
-                      </w:rPr>
-                      <w:t>ESQUIVEL</w:t>
-                    </w:r>
-                    <w:r>
-                      <w:rPr>
-                        <w:rFonts w:ascii="Calibri"/>
-                        <w:b/>
-                        <w:spacing w:val="-7"/>
-                      </w:rPr>
-                      <w:t xml:space="preserve"> </w:t>
-                    </w:r>
-                    <w:r>
-                      <w:rPr>
-                        <w:rFonts w:ascii="Calibri"/>
-                        <w:b/>
-                        <w:spacing w:val="-4"/>
-                      </w:rPr>
-                      <w:t>PANDO</w:t>
-                    </w:r>
-                  </w:p>
-                </w:txbxContent>
-              </v:textbox>
-              <w10:wrap anchorx="page" anchory="page"/>
-            </v:shape>
-          </w:pict>
-        </mc:Fallback>
-      </mc:AlternateContent>
-    </w:r>
-    <w:r>
-      <w:rPr>
-        <w:noProof/>
-      </w:rPr>
-      <mc:AlternateContent>
-        <mc:Choice Requires="wps">
-          <w:drawing>
-            <wp:anchor distT="0" distB="0" distL="0" distR="0" simplePos="0" relativeHeight="251659776" behindDoc="1" locked="0" layoutInCell="1" allowOverlap="1" wp14:anchorId="66DE74A1" wp14:editId="7F2D2EBC">
-              <wp:simplePos x="0" y="0"/>
-              <wp:positionH relativeFrom="page">
-                <wp:posOffset>5536184</wp:posOffset>
-              </wp:positionH>
-              <wp:positionV relativeFrom="page">
-                <wp:posOffset>639698</wp:posOffset>
-              </wp:positionV>
-              <wp:extent cx="1100455" cy="165100"/>
-              <wp:effectExtent l="0" t="0" r="0" b="0"/>
-              <wp:wrapNone/>
-              <wp:docPr id="3" name="Textbox 3"/>
-              <wp:cNvGraphicFramePr>
-                <a:graphicFrameLocks xmlns:a="http://schemas.openxmlformats.org/drawingml/2006/main"/>
-              </wp:cNvGraphicFramePr>
-              <a:graphic xmlns:a="http://schemas.openxmlformats.org/drawingml/2006/main">
-                <a:graphicData uri="http://schemas.microsoft.com/office/word/2010/wordprocessingShape">
-                  <wps:wsp>
-                    <wps:cNvSpPr txBox="1">
-                      <a:spLocks/>
-                    </wps:cNvSpPr>
-                    <wps:spPr>
-                      <a:xfrm>
-                        <a:off x="0" y="0"/>
-                        <a:ext cx="1100455" cy="165100"/>
-                      </a:xfrm>
-                      <a:prstGeom prst="rect">
-                        <a:avLst/>
-                      </a:prstGeom>
-                    </wps:spPr>
-                    <wps:txbx>
-                      <w:txbxContent>
-                        <w:p>
-                          <w:pPr>
-                            <w:spacing w:line="244" w:lineRule="exact"/>
-                            <w:ind w:left="20"/>
-                            <w:rPr>
-                              <w:rFonts w:ascii="Calibri"/>
-                              <w:b/>
-                            </w:rPr>
-                          </w:pPr>
-                          <w:r>
-                            <w:rPr>
-                              <w:rFonts w:ascii="Calibri"/>
-                              <w:b/>
-                            </w:rPr>
-                            <w:t>RUC:</w:t>
-                          </w:r>
-                          <w:r>
-                            <w:rPr>
-                              <w:rFonts w:ascii="Calibri"/>
-                              <w:b/>
-                              <w:spacing w:val="-6"/>
-                            </w:rPr>
-                            <w:t xml:space="preserve"> </w:t>
-                          </w:r>
-                          <w:r>
-                            <w:rPr>
-                              <w:rFonts w:ascii="Calibri"/>
-                              <w:b/>
-                              <w:spacing w:val="-2"/>
-                            </w:rPr>
-                            <w:t>10266739414</w:t>
-                          </w:r>
-                        </w:p>
-                      </w:txbxContent>
-                    </wps:txbx>
-                    <wps:bodyPr wrap="square" lIns="0" tIns="0" rIns="0" bIns="0" rtlCol="0">
-                      <a:noAutofit/>
-                    </wps:bodyPr>
-                  </wps:wsp>
-                </a:graphicData>
-              </a:graphic>
-            </wp:anchor>
-          </w:drawing>
-        </mc:Choice>
-        <mc:Fallback>
-          <w:pict>
-            <v:shape w14:anchorId="66DE74A1" id="Textbox 3" o:spid="_x0000_s1027" type="#_x0000_t202" style="position:absolute;margin-left:435.9pt;margin-top:50.35pt;width:86.65pt;height:13pt;z-index:-251656704;visibility:visible;mso-wrap-style:square;mso-wrap-distance-left:0;mso-wrap-distance-top:0;mso-wrap-distance-right:0;mso-wrap-distance-bottom:0;mso-position-horizontal:absolute;mso-position-horizontal-relative:page;mso-position-vertical:absolute;mso-position-vertical-relative:page;v-text-anchor:top" o:gfxdata="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" filled="f" stroked="f">
-              <v:textbox inset="0,0,0,0">
-                <w:txbxContent>
-                  <w:p>
-                    <w:pPr>
-                      <w:spacing w:line="244" w:lineRule="exact"/>
-                      <w:ind w:left="20"/>
-                      <w:rPr>
-                        <w:rFonts w:ascii="Calibri"/>
-                        <w:b/>
-                      </w:rPr>
-                    </w:pPr>
-                    <w:r>
-                      <w:rPr>
-                        <w:rFonts w:ascii="Calibri"/>
-                        <w:b/>
-                      </w:rPr>
-                      <w:t>RUC:</w:t>
-                    </w:r>
-                    <w:r>
-                      <w:rPr>
-                        <w:rFonts w:ascii="Calibri"/>
-                        <w:b/>
-                        <w:spacing w:val="-6"/>
-                      </w:rPr>
-                      <w:t xml:space="preserve"> </w:t>
-                    </w:r>
-                    <w:r>
-                      <w:rPr>
-                        <w:rFonts w:ascii="Calibri"/>
-                        <w:b/>
-                        <w:spacing w:val="-2"/>
-                      </w:rPr>
-                      <w:t>10266739414</w:t>
-                    </w:r>
-                  </w:p>
-                </w:txbxContent>
-              </v:textbox>
-              <w10:wrap anchorx="page" anchory="page"/>
-            </v:shape>
-          </w:pict>
-        </mc:Fallback>
-      </mc:AlternateContent>
-    </w:r>
-    <w:r>
-      <w:rPr>
-        <w:noProof/>
-      </w:rPr>
-      <mc:AlternateContent>
-        <mc:Choice Requires="wps">
-          <w:drawing>
-            <wp:anchor distT="0" distB="0" distL="0" distR="0" simplePos="0" relativeHeight="251661824" behindDoc="1" locked="0" layoutInCell="1" allowOverlap="1" wp14:anchorId="0366D1DE" wp14:editId="1A8DF6F6">
-              <wp:simplePos x="0" y="0"/>
-              <wp:positionH relativeFrom="page">
-                <wp:posOffset>884237</wp:posOffset>
-              </wp:positionH>
-              <wp:positionV relativeFrom="page">
-                <wp:posOffset>812419</wp:posOffset>
-              </wp:positionV>
-              <wp:extent cx="5787390" cy="328295"/>
-              <wp:effectExtent l="0" t="0" r="0" b="0"/>
-              <wp:wrapNone/>
-              <wp:docPr id="4" name="Textbox 4"/>
-              <wp:cNvGraphicFramePr>
-                <a:graphicFrameLocks xmlns:a="http://schemas.openxmlformats.org/drawingml/2006/main"/>
-              </wp:cNvGraphicFramePr>
-              <a:graphic xmlns:a="http://schemas.openxmlformats.org/drawingml/2006/main">
-                <a:graphicData uri="http://schemas.microsoft.com/office/word/2010/wordprocessingShape">
-                  <wps:wsp>
-                    <wps:cNvSpPr txBox="1">
-                      <a:spLocks/>
-                    </wps:cNvSpPr>
-                    <wps:spPr>
-                      <a:xfrm>
-                        <a:off x="0" y="0"/>
-                        <a:ext cx="5787390" cy="328295"/>
-                      </a:xfrm>
-                      <a:prstGeom prst="rect">
-                        <a:avLst/>
-                      </a:prstGeom>
-                    </wps:spPr>
-                    <wps:txbx>
-                      <w:txbxContent>
-                        <w:p>
-                          <w:pPr>
-                            <w:spacing w:line="238" w:lineRule="exact"/>
-                            <w:ind w:left="24"/>
-                            <w:rPr>
-                              <w:rFonts w:ascii="Calibri" w:hAnsi="Calibri"/>
-                              <w:b/>
-                            </w:rPr>
-                          </w:pPr>
-                          <w:r>
-                            <w:rPr>
-                              <w:rFonts w:ascii="Calibri" w:hAnsi="Calibri"/>
-                              <w:b/>
-                            </w:rPr>
-                            <w:t>SERVICIOS</w:t>
-                          </w:r>
-                          <w:r>
-                            <w:rPr>
-                              <w:rFonts w:ascii="Calibri" w:hAnsi="Calibri"/>
-                              <w:b/>
-                              <w:spacing w:val="-14"/>
-                            </w:rPr>
-                            <w:t xml:space="preserve"> </w:t>
-                          </w:r>
-                          <w:r>
-                            <w:rPr>
-                              <w:rFonts w:ascii="Calibri" w:hAnsi="Calibri"/>
-                              <w:b/>
-                            </w:rPr>
-                            <w:t>Y</w:t>
-                          </w:r>
-                          <w:r>
-                            <w:rPr>
-                              <w:rFonts w:ascii="Calibri" w:hAnsi="Calibri"/>
-                              <w:b/>
-                              <w:spacing w:val="-11"/>
-                            </w:rPr>
-                            <w:t xml:space="preserve"> </w:t>
-                          </w:r>
-                          <w:r>
-                            <w:rPr>
-                              <w:rFonts w:ascii="Calibri" w:hAnsi="Calibri"/>
-                              <w:b/>
-                            </w:rPr>
-                            <w:t>ALQUILER</w:t>
-                          </w:r>
-                          <w:r>
-                            <w:rPr>
-                              <w:rFonts w:ascii="Calibri" w:hAnsi="Calibri"/>
-                              <w:b/>
-                              <w:spacing w:val="-7"/>
-                            </w:rPr>
-                            <w:t xml:space="preserve"> </w:t>
-                          </w:r>
-                          <w:r>
-                            <w:rPr>
-                              <w:rFonts w:ascii="Calibri" w:hAnsi="Calibri"/>
-                              <w:b/>
-                            </w:rPr>
-                            <w:t>DE</w:t>
-                          </w:r>
-                          <w:r>
-                            <w:rPr>
-                              <w:rFonts w:ascii="Calibri" w:hAnsi="Calibri"/>
-                              <w:b/>
-                              <w:spacing w:val="-8"/>
-                            </w:rPr>
-                            <w:t xml:space="preserve"> </w:t>
-                          </w:r>
-                          <w:r>
-                            <w:rPr>
-                              <w:rFonts w:ascii="Calibri" w:hAnsi="Calibri"/>
-                              <w:b/>
-                            </w:rPr>
-                            <w:t>GRUPOS</w:t>
-                          </w:r>
-                          <w:r>
-                            <w:rPr>
-                              <w:rFonts w:ascii="Calibri" w:hAnsi="Calibri"/>
-                              <w:b/>
-                              <w:spacing w:val="-13"/>
-                            </w:rPr>
-                            <w:t xml:space="preserve"> </w:t>
-                          </w:r>
-                          <w:r>
-                            <w:rPr>
-                              <w:rFonts w:ascii="Calibri" w:hAnsi="Calibri"/>
-                              <w:b/>
-                            </w:rPr>
-                            <w:t>ELECTRÓGENOS,</w:t>
-                          </w:r>
-                          <w:r>
-                            <w:rPr>
-                              <w:rFonts w:ascii="Calibri" w:hAnsi="Calibri"/>
-                              <w:b/>
-                              <w:spacing w:val="-8"/>
-                            </w:rPr>
-                            <w:t xml:space="preserve"> </w:t>
-                          </w:r>
-                          <w:r>
-                            <w:rPr>
-                              <w:rFonts w:ascii="Calibri" w:hAnsi="Calibri"/>
-                              <w:b/>
-                            </w:rPr>
-                            <w:t>COMPRESORAS</w:t>
-                          </w:r>
-                          <w:r>
-                            <w:rPr>
-                              <w:rFonts w:ascii="Calibri" w:hAnsi="Calibri"/>
-                              <w:b/>
-                              <w:spacing w:val="-3"/>
-                            </w:rPr>
-                            <w:t xml:space="preserve"> </w:t>
-                          </w:r>
-                          <w:r>
-                            <w:rPr>
-                              <w:rFonts w:ascii="Calibri" w:hAnsi="Calibri"/>
-                              <w:b/>
-                            </w:rPr>
-                            <w:t>Y</w:t>
-                          </w:r>
-                          <w:r>
-                            <w:rPr>
-                              <w:rFonts w:ascii="Calibri" w:hAnsi="Calibri"/>
-                              <w:b/>
-                              <w:spacing w:val="-12"/>
-                            </w:rPr>
-                            <w:t xml:space="preserve"> </w:t>
-                          </w:r>
-                          <w:r>
-                            <w:rPr>
-                              <w:rFonts w:ascii="Calibri" w:hAnsi="Calibri"/>
-                              <w:b/>
-                            </w:rPr>
-                            <w:t>EQUIPOS</w:t>
-                          </w:r>
-                          <w:r>
-                            <w:rPr>
-                              <w:rFonts w:ascii="Calibri" w:hAnsi="Calibri"/>
-                              <w:b/>
-                              <w:spacing w:val="-8"/>
-                            </w:rPr>
-                            <w:t xml:space="preserve"> </w:t>
-                          </w:r>
-                          <w:r>
-                            <w:rPr>
-                              <w:rFonts w:ascii="Calibri" w:hAnsi="Calibri"/>
-                              <w:b/>
-                            </w:rPr>
-                            <w:t>DE</w:t>
-                          </w:r>
-                          <w:r>
-                            <w:rPr>
-                              <w:rFonts w:ascii="Calibri" w:hAnsi="Calibri"/>
-                              <w:b/>
-                              <w:spacing w:val="-3"/>
-                            </w:rPr>
-                            <w:t xml:space="preserve"> </w:t>
-                          </w:r>
-                          <w:r>
-                            <w:rPr>
-                              <w:rFonts w:ascii="Calibri" w:hAnsi="Calibri"/>
-                              <w:b/>
-                              <w:spacing w:val="-2"/>
-                            </w:rPr>
-                            <w:t>CONSTRUCCIÓN.</w:t>
-                          </w:r>
-                        </w:p>
-                        <w:p>
-                          <w:pPr>
-                            <w:spacing w:line="262" w:lineRule="exact"/>
-                            <w:ind w:left="20"/>
-                            <w:rPr>
-                              <w:rFonts w:ascii="Calibri" w:hAnsi="Calibri"/>
-                              <w:b/>
-                            </w:rPr>
-                          </w:pPr>
-                          <w:r>
-                            <w:rPr>
-                              <w:rFonts w:ascii="Calibri" w:hAnsi="Calibri"/>
-                              <w:b/>
-                            </w:rPr>
-                            <w:t>AV.</w:t>
-                          </w:r>
-                          <w:r>
-                            <w:rPr>
-                              <w:rFonts w:ascii="Calibri" w:hAnsi="Calibri"/>
-                              <w:b/>
-                              <w:spacing w:val="-6"/>
-                            </w:rPr>
-                            <w:t xml:space="preserve"> </w:t>
-                          </w:r>
-                          <w:r>
-                            <w:rPr>
-                              <w:rFonts w:ascii="Calibri" w:hAnsi="Calibri"/>
-                              <w:b/>
-                            </w:rPr>
-                            <w:t>ATAHUALPA</w:t>
-                          </w:r>
-                          <w:r>
-                            <w:rPr>
-                              <w:rFonts w:ascii="Calibri" w:hAnsi="Calibri"/>
-                              <w:b/>
-                              <w:spacing w:val="-7"/>
-                            </w:rPr>
-                            <w:t xml:space="preserve"> </w:t>
-                          </w:r>
-                          <w:r>
-                            <w:rPr>
-                              <w:rFonts w:ascii="Calibri" w:hAnsi="Calibri"/>
-                              <w:b/>
-                            </w:rPr>
-                            <w:t>810</w:t>
-                          </w:r>
-                          <w:r>
-                            <w:rPr>
-                              <w:rFonts w:ascii="Calibri" w:hAnsi="Calibri"/>
-                              <w:b/>
-                              <w:spacing w:val="-2"/>
-                            </w:rPr>
-                            <w:t xml:space="preserve"> </w:t>
-                          </w:r>
-                          <w:r>
-                            <w:rPr>
-                              <w:rFonts w:ascii="Calibri" w:hAnsi="Calibri"/>
-                              <w:b/>
-                            </w:rPr>
-                            <w:t>–</w:t>
-                          </w:r>
-                          <w:r>
-                            <w:rPr>
-                              <w:rFonts w:ascii="Calibri" w:hAnsi="Calibri"/>
-                              <w:b/>
-                              <w:spacing w:val="-5"/>
-                            </w:rPr>
-                            <w:t xml:space="preserve"> </w:t>
-                          </w:r>
-                          <w:r>
-                            <w:rPr>
-                              <w:rFonts w:ascii="Calibri" w:hAnsi="Calibri"/>
-                              <w:b/>
-                            </w:rPr>
-                            <w:t>CAJAMARCA -</w:t>
-                          </w:r>
-                          <w:r>
-                            <w:rPr>
-                              <w:rFonts w:ascii="Calibri" w:hAnsi="Calibri"/>
-                              <w:b/>
-                              <w:spacing w:val="-6"/>
-                            </w:rPr>
-                            <w:t xml:space="preserve"> </w:t>
-                          </w:r>
-                          <w:r>
-                            <w:rPr>
-                              <w:rFonts w:ascii="Calibri" w:hAnsi="Calibri"/>
-                              <w:b/>
-                            </w:rPr>
-                            <w:t>TELÉF.</w:t>
-                          </w:r>
-                          <w:r>
-                            <w:rPr>
-                              <w:rFonts w:ascii="Calibri" w:hAnsi="Calibri"/>
-                              <w:b/>
-                            </w:rPr>
-                            <w:t xml:space="preserve"> </w:t>
-                          </w:r>
-                          <w:r>
-                            <w:rPr>
-                              <w:rFonts w:ascii="Calibri" w:hAnsi="Calibri"/>
-                              <w:b/>
-                            </w:rPr>
-                            <w:t>976959490</w:t>
-                          </w:r>
-                          <w:r>
-                            <w:rPr>
-                              <w:rFonts w:ascii="Calibri" w:hAnsi="Calibri"/>
-                              <w:b/>
-                              <w:spacing w:val="-5"/>
-                            </w:rPr>
-                            <w:t xml:space="preserve"> </w:t>
-                          </w:r>
-                          <w:r>
-                            <w:rPr>
-                              <w:rFonts w:ascii="Calibri" w:hAnsi="Calibri"/>
-                              <w:b/>
-                            </w:rPr>
-                            <w:t>–</w:t>
-                          </w:r>
-                          <w:r>
-                            <w:rPr>
-                              <w:rFonts w:ascii="Calibri" w:hAnsi="Calibri"/>
-                              <w:b/>
-                              <w:spacing w:val="37"/>
-                            </w:rPr>
-                            <w:t xml:space="preserve"> </w:t>
-                          </w:r>
-                          <w:r>
-                            <w:rPr>
-                              <w:rFonts w:ascii="Calibri" w:hAnsi="Calibri"/>
-                              <w:b/>
-                              <w:spacing w:val="-2"/>
-                            </w:rPr>
-                            <w:t>955425015</w:t>
-                          </w:r>
-                          <w:r>
-                            <w:rPr>
-                              <w:rFonts w:ascii="Calibri" w:hAnsi="Calibri"/>
-                              <w:b/>
-                              <w:spacing w:val="-2"/>
-                            </w:rPr>
-                            <w:t xml:space="preserve"> - 969775015</w:t>
-                          </w:r>
-                        </w:p>
-                      </w:txbxContent>
-                    </wps:txbx>
-                    <wps:bodyPr wrap="square" lIns="0" tIns="0" rIns="0" bIns="0" rtlCol="0">
-                      <a:noAutofit/>
-                    </wps:bodyPr>
-                  </wps:wsp>
-                </a:graphicData>
-              </a:graphic>
-            </wp:anchor>
-          </w:drawing>
-        </mc:Choice>
-        <mc:Fallback>
-          <w:pict>
-            <v:shape w14:anchorId="0366D1DE" id="Textbox 4" o:spid="_x0000_s1028" type="#_x0000_t202" style="position:absolute;margin-left:69.6pt;margin-top:63.95pt;width:455.7pt;height:25.85pt;z-index:-251654656;visibility:visible;mso-wrap-style:square;mso-wrap-distance-left:0;mso-wrap-distance-top:0;mso-wrap-distance-right:0;mso-wrap-distance-bottom:0;mso-position-horizontal:absolute;mso-position-horizontal-relative:page;mso-position-vertical:absolute;mso-position-vertical-relative:page;v-text-anchor:top" o:gfxdata="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" filled="f" stroked="f">
-              <v:textbox inset="0,0,0,0">
-                <w:txbxContent>
-                  <w:p>
-                    <w:pPr>
-                      <w:spacing w:line="238" w:lineRule="exact"/>
-                      <w:ind w:left="24"/>
-                      <w:rPr>
-                        <w:rFonts w:ascii="Calibri" w:hAnsi="Calibri"/>
-                        <w:b/>
-                      </w:rPr>
-                    </w:pPr>
-                    <w:r>
-                      <w:rPr>
-                        <w:rFonts w:ascii="Calibri" w:hAnsi="Calibri"/>
-                        <w:b/>
-                      </w:rPr>
-                      <w:t>SERVICIOS</w:t>
-                    </w:r>
-                    <w:r>
-                      <w:rPr>
-                        <w:rFonts w:ascii="Calibri" w:hAnsi="Calibri"/>
-                        <w:b/>
-                        <w:spacing w:val="-14"/>
-                      </w:rPr>
-                      <w:t xml:space="preserve"> </w:t>
-                    </w:r>
-                    <w:r>
-                      <w:rPr>
-                        <w:rFonts w:ascii="Calibri" w:hAnsi="Calibri"/>
-                        <w:b/>
-                      </w:rPr>
-                      <w:t>Y</w:t>
-                    </w:r>
-                    <w:r>
-                      <w:rPr>
-                        <w:rFonts w:ascii="Calibri" w:hAnsi="Calibri"/>
-                        <w:b/>
-                        <w:spacing w:val="-11"/>
-                      </w:rPr>
-                      <w:t xml:space="preserve"> </w:t>
-                    </w:r>
-                    <w:r>
-                      <w:rPr>
-                        <w:rFonts w:ascii="Calibri" w:hAnsi="Calibri"/>
-                        <w:b/>
-                      </w:rPr>
-                      <w:t>ALQUILER</w:t>
-                    </w:r>
-                    <w:r>
-                      <w:rPr>
-                        <w:rFonts w:ascii="Calibri" w:hAnsi="Calibri"/>
-                        <w:b/>
-                        <w:spacing w:val="-7"/>
-                      </w:rPr>
-                      <w:t xml:space="preserve"> </w:t>
-                    </w:r>
-                    <w:r>
-                      <w:rPr>
-                        <w:rFonts w:ascii="Calibri" w:hAnsi="Calibri"/>
-                        <w:b/>
-                      </w:rPr>
-                      <w:t>DE</w:t>
-                    </w:r>
-                    <w:r>
-                      <w:rPr>
-                        <w:rFonts w:ascii="Calibri" w:hAnsi="Calibri"/>
-                        <w:b/>
-                        <w:spacing w:val="-8"/>
-                      </w:rPr>
-                      <w:t xml:space="preserve"> </w:t>
-                    </w:r>
-                    <w:r>
-                      <w:rPr>
-                        <w:rFonts w:ascii="Calibri" w:hAnsi="Calibri"/>
-                        <w:b/>
-                      </w:rPr>
-                      <w:t>GRUPOS</w:t>
-                    </w:r>
-                    <w:r>
-                      <w:rPr>
-                        <w:rFonts w:ascii="Calibri" w:hAnsi="Calibri"/>
-                        <w:b/>
-                        <w:spacing w:val="-13"/>
-                      </w:rPr>
-                      <w:t xml:space="preserve"> </w:t>
-                    </w:r>
-                    <w:r>
-                      <w:rPr>
-                        <w:rFonts w:ascii="Calibri" w:hAnsi="Calibri"/>
-                        <w:b/>
-                      </w:rPr>
-                      <w:t>ELECTRÓGENOS,</w:t>
-                    </w:r>
-                    <w:r>
-                      <w:rPr>
-                        <w:rFonts w:ascii="Calibri" w:hAnsi="Calibri"/>
-                        <w:b/>
-                        <w:spacing w:val="-8"/>
-                      </w:rPr>
-                      <w:t xml:space="preserve"> </w:t>
-                    </w:r>
-                    <w:r>
-                      <w:rPr>
-                        <w:rFonts w:ascii="Calibri" w:hAnsi="Calibri"/>
-                        <w:b/>
-                      </w:rPr>
-                      <w:t>COMPRESORAS</w:t>
-                    </w:r>
-                    <w:r>
-                      <w:rPr>
-                        <w:rFonts w:ascii="Calibri" w:hAnsi="Calibri"/>
-                        <w:b/>
-                        <w:spacing w:val="-3"/>
-                      </w:rPr>
-                      <w:t xml:space="preserve"> </w:t>
-                    </w:r>
-                    <w:r>
-                      <w:rPr>
-                        <w:rFonts w:ascii="Calibri" w:hAnsi="Calibri"/>
-                        <w:b/>
-                      </w:rPr>
-                      <w:t>Y</w:t>
-                    </w:r>
-                    <w:r>
-                      <w:rPr>
-                        <w:rFonts w:ascii="Calibri" w:hAnsi="Calibri"/>
-                        <w:b/>
-                        <w:spacing w:val="-12"/>
-                      </w:rPr>
-                      <w:t xml:space="preserve"> </w:t>
-                    </w:r>
-                    <w:r>
-                      <w:rPr>
-                        <w:rFonts w:ascii="Calibri" w:hAnsi="Calibri"/>
-                        <w:b/>
-                      </w:rPr>
-                      <w:t>EQUIPOS</w:t>
-                    </w:r>
-                    <w:r>
-                      <w:rPr>
-                        <w:rFonts w:ascii="Calibri" w:hAnsi="Calibri"/>
-                        <w:b/>
-                        <w:spacing w:val="-8"/>
-                      </w:rPr>
-                      <w:t xml:space="preserve"> </w:t>
-                    </w:r>
-                    <w:r>
-                      <w:rPr>
-                        <w:rFonts w:ascii="Calibri" w:hAnsi="Calibri"/>
-                        <w:b/>
-                      </w:rPr>
-                      <w:t>DE</w:t>
-                    </w:r>
-                    <w:r>
-                      <w:rPr>
-                        <w:rFonts w:ascii="Calibri" w:hAnsi="Calibri"/>
-                        <w:b/>
-                        <w:spacing w:val="-3"/>
-                      </w:rPr>
-                      <w:t xml:space="preserve"> </w:t>
-                    </w:r>
-                    <w:r>
-                      <w:rPr>
-                        <w:rFonts w:ascii="Calibri" w:hAnsi="Calibri"/>
-                        <w:b/>
-                        <w:spacing w:val="-2"/>
-                      </w:rPr>
-                      <w:t>CONSTRUCCIÓN.</w:t>
-                    </w:r>
-                  </w:p>
-                  <w:p>
-                    <w:pPr>
-                      <w:spacing w:line="262" w:lineRule="exact"/>
-                      <w:ind w:left="20"/>
-                      <w:rPr>
-                        <w:rFonts w:ascii="Calibri" w:hAnsi="Calibri"/>
-                        <w:b/>
-                      </w:rPr>
-                    </w:pPr>
-                    <w:r>
-                      <w:rPr>
-                        <w:rFonts w:ascii="Calibri" w:hAnsi="Calibri"/>
-                        <w:b/>
-                      </w:rPr>
-                      <w:t>AV.</w:t>
-                    </w:r>
-                    <w:r>
-                      <w:rPr>
-                        <w:rFonts w:ascii="Calibri" w:hAnsi="Calibri"/>
-                        <w:b/>
-                        <w:spacing w:val="-6"/>
-                      </w:rPr>
-                      <w:t xml:space="preserve"> </w:t>
-                    </w:r>
-                    <w:r>
-                      <w:rPr>
-                        <w:rFonts w:ascii="Calibri" w:hAnsi="Calibri"/>
-                        <w:b/>
-                      </w:rPr>
-                      <w:t>ATAHUALPA</w:t>
-                    </w:r>
-                    <w:r>
-                      <w:rPr>
-                        <w:rFonts w:ascii="Calibri" w:hAnsi="Calibri"/>
-                        <w:b/>
-                        <w:spacing w:val="-7"/>
-                      </w:rPr>
-                      <w:t xml:space="preserve"> </w:t>
-                    </w:r>
-                    <w:r>
-                      <w:rPr>
-                        <w:rFonts w:ascii="Calibri" w:hAnsi="Calibri"/>
-                        <w:b/>
-                      </w:rPr>
-                      <w:t>810</w:t>
-                    </w:r>
-                    <w:r>
-                      <w:rPr>
-                        <w:rFonts w:ascii="Calibri" w:hAnsi="Calibri"/>
-                        <w:b/>
-                        <w:spacing w:val="-2"/>
-                      </w:rPr>
-                      <w:t xml:space="preserve"> </w:t>
-                    </w:r>
-                    <w:r>
-                      <w:rPr>
-                        <w:rFonts w:ascii="Calibri" w:hAnsi="Calibri"/>
-                        <w:b/>
-                      </w:rPr>
-                      <w:t>–</w:t>
-                    </w:r>
-                    <w:r>
-                      <w:rPr>
-                        <w:rFonts w:ascii="Calibri" w:hAnsi="Calibri"/>
-                        <w:b/>
-                        <w:spacing w:val="-5"/>
-                      </w:rPr>
-                      <w:t xml:space="preserve"> </w:t>
-                    </w:r>
-                    <w:r>
-                      <w:rPr>
-                        <w:rFonts w:ascii="Calibri" w:hAnsi="Calibri"/>
-                        <w:b/>
-                      </w:rPr>
-                      <w:t>CAJAMARCA -</w:t>
-                    </w:r>
-                    <w:r>
-                      <w:rPr>
-                        <w:rFonts w:ascii="Calibri" w:hAnsi="Calibri"/>
-                        <w:b/>
-                        <w:spacing w:val="-6"/>
-                      </w:rPr>
-                      <w:t xml:space="preserve"> </w:t>
-                    </w:r>
-                    <w:r>
-                      <w:rPr>
-                        <w:rFonts w:ascii="Calibri" w:hAnsi="Calibri"/>
-                        <w:b/>
-                      </w:rPr>
-                      <w:t>TELÉF.</w:t>
-                    </w:r>
-                    <w:r>
-                      <w:rPr>
-                        <w:rFonts w:ascii="Calibri" w:hAnsi="Calibri"/>
-                        <w:b/>
-                      </w:rPr>
-                      <w:t xml:space="preserve"> </w:t>
-                    </w:r>
-                    <w:r>
-                      <w:rPr>
-                        <w:rFonts w:ascii="Calibri" w:hAnsi="Calibri"/>
-                        <w:b/>
-                      </w:rPr>
-                      <w:t>976959490</w:t>
-                    </w:r>
-                    <w:r>
-                      <w:rPr>
-                        <w:rFonts w:ascii="Calibri" w:hAnsi="Calibri"/>
-                        <w:b/>
-                        <w:spacing w:val="-5"/>
-                      </w:rPr>
-                      <w:t xml:space="preserve"> </w:t>
-                    </w:r>
-                    <w:r>
-                      <w:rPr>
-                        <w:rFonts w:ascii="Calibri" w:hAnsi="Calibri"/>
-                        <w:b/>
-                      </w:rPr>
-                      <w:t>–</w:t>
-                    </w:r>
-                    <w:r>
-                      <w:rPr>
-                        <w:rFonts w:ascii="Calibri" w:hAnsi="Calibri"/>
-                        <w:b/>
-                        <w:spacing w:val="37"/>
-                      </w:rPr>
-                      <w:t xml:space="preserve"> </w:t>
-                    </w:r>
-                    <w:r>
-                      <w:rPr>
-                        <w:rFonts w:ascii="Calibri" w:hAnsi="Calibri"/>
-                        <w:b/>
-                        <w:spacing w:val="-2"/>
-                      </w:rPr>
-                      <w:t>955425015</w:t>
-                    </w:r>
-                    <w:r>
-                      <w:rPr>
-                        <w:rFonts w:ascii="Calibri" w:hAnsi="Calibri"/>
-                        <w:b/>
-                        <w:spacing w:val="-2"/>
-                      </w:rPr>
-                      <w:t xml:space="preserve"> - 969775015</w:t>
-                    </w:r>
-                  </w:p>
-                </w:txbxContent>
-              </v:textbox>
-              <w10:wrap anchorx="page" anchory="page"/>
-            </v:shape>
-          </w:pict>
-        </mc:Fallback>
-      </mc:AlternateContent>
-    </w:r>
-  </w:p>
-</w:hdr>
-</file>
-
-<file path=word/header2.xml><?xml version="1.0" encoding="utf-8"?>
 <w:hdr xmlns:wpc="http://schemas.microsoft.com/office/word/2010/wordprocessingCanvas" xmlns:cx="http://schemas.microsoft.com/office/drawing/2014/chartex" xmlns:cx1="http://schemas.microsoft.com/office/drawing/2015/9/8/chartex" xmlns:cx2="http://schemas.microsoft.com/office/drawing/2015/10/21/chartex" xmlns:cx3="http://schemas.microsoft.com/office/drawing/2016/5/9/chartex" xmlns:cx4="http://schemas.microsoft.com/office/drawing/2016/5/10/chartex" xmlns:cx5="http://schemas.microsoft.com/office/drawing/2016/5/11/chartex" xmlns:cx6="http://schemas.microsoft.com/office/drawing/2016/5/12/chartex" xmlns:cx7="http://schemas.microsoft.com/office/drawing/2016/5/13/chartex" xmlns:cx8="http://schemas.microsoft.com/office/drawing/2016/5/14/chartex" xmlns:mc="http://schemas.openxmlformats.org/markup-compatibility/2006" xmlns:aink="http://schemas.microsoft.com/office/drawing/2016/ink" xmlns:am3d="http://schemas.microsoft.com/office/drawing/2017/model3d" xmlns:o="urn:schemas-microsoft-com:office:office" xmlns:oel="http://schemas.microsoft.com/office/2019/extlst" xmlns:r="http://schemas.openxmlformats.org/officeDocument/2006/relationships" xmlns:m="http://schemas.openxmlformats.org/officeDocument/2006/math" xmlns:v="urn:schemas-microsoft-com:vml" xmlns:wp14="http://schemas.microsoft.com/office/word/2010/wordprocessingDrawing" xmlns:wp="http://schemas.openxmlformats.org/drawingml/2006/wordprocessingDrawing" xmlns:w10="urn:schemas-microsoft-com:office:word" xmlns:w="http://schemas.openxmlformats.org/wordprocessingml/2006/main" xmlns:w14="http://schemas.microsoft.com/office/word/2010/wordml" xmlns:w15="http://schemas.microsoft.com/office/word/2012/wordml" xmlns:w16cex="http://schemas.microsoft.com/office/word/2018/wordml/cex" xmlns:w16cid="http://schemas.microsoft.com/office/word/2016/wordml/cid" xmlns:w16="http://schemas.microsoft.com/office/word/2018/wordml" xmlns:w16sdtdh="http://schemas.microsoft.com/office/word/2020/wordml/sdtdatahash" xmlns:w16se="http://schemas.microsoft.com/office/word/2015/wordml/symex" xmlns:wpg="http://schemas.microsoft.com/office/word/2010/wordprocessingGroup" xmlns:wpi="http://schemas.microsoft.com/office/word/2010/wordprocessingInk" xmlns:wne="http://schemas.microsoft.com/office/word/2006/wordml" xmlns:wps="http://schemas.microsoft.com/office/word/2010/wordprocessingShape" mc:Ignorable="w14 w15 w16se w16cid w16 w16cex w16sdtdh wp14">
   <w:p>
     <w:pPr>
@@ -3524,7 +2258,7 @@
               <v:stroke joinstyle="miter"/>
               <v:path gradientshapeok="t" o:connecttype="rect"/>
             </v:shapetype>
-            <v:shape id="Textbox 26" o:spid="_x0000_s1029" type="#_x0000_t202" style="position:absolute;margin-left:69.8pt;margin-top:36.95pt;width:164.05pt;height:25.85pt;z-index:-251664896;visibility:visible;mso-wrap-style:square;mso-wrap-distance-left:0;mso-wrap-distance-top:0;mso-wrap-distance-right:0;mso-wrap-distance-bottom:0;mso-position-horizontal:absolute;mso-position-horizontal-relative:page;mso-position-vertical:absolute;mso-position-vertical-relative:page;v-text-anchor:top" o:gfxdata="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" filled="f" stroked="f">
+            <v:shape id="Textbox 26" o:spid="_x0000_s1026" type="#_x0000_t202" style="position:absolute;margin-left:69.8pt;margin-top:36.95pt;width:164.05pt;height:25.85pt;z-index:-251664896;visibility:visible;mso-wrap-style:square;mso-wrap-distance-left:0;mso-wrap-distance-top:0;mso-wrap-distance-right:0;mso-wrap-distance-bottom:0;mso-position-horizontal:absolute;mso-position-horizontal-relative:page;mso-position-vertical:absolute;mso-position-vertical-relative:page;v-text-anchor:top" o:gfxdata="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" filled="f" stroked="f">
               <v:textbox inset="0,0,0,0">
                 <w:txbxContent>
                   <w:p>
@@ -3747,7 +2481,7 @@
         </mc:Choice>
         <mc:Fallback>
           <w:pict>
-            <v:shape w14:anchorId="65E96A7C" id="Textbox 27" o:spid="_x0000_s1030" type="#_x0000_t202" style="position:absolute;margin-left:435.9pt;margin-top:50.35pt;width:86.65pt;height:13pt;z-index:-251663872;visibility:visible;mso-wrap-style:square;mso-wrap-distance-left:0;mso-wrap-distance-top:0;mso-wrap-distance-right:0;mso-wrap-distance-bottom:0;mso-position-horizontal:absolute;mso-position-horizontal-relative:page;mso-position-vertical:absolute;mso-position-vertical-relative:page;v-text-anchor:top" o:gfxdata="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" filled="f" stroked="f">
+            <v:shape w14:anchorId="65E96A7C" id="Textbox 27" o:spid="_x0000_s1027" type="#_x0000_t202" style="position:absolute;margin-left:435.9pt;margin-top:50.35pt;width:86.65pt;height:13pt;z-index:-251663872;visibility:visible;mso-wrap-style:square;mso-wrap-distance-left:0;mso-wrap-distance-top:0;mso-wrap-distance-right:0;mso-wrap-distance-bottom:0;mso-position-horizontal:absolute;mso-position-horizontal-relative:page;mso-position-vertical:absolute;mso-position-vertical-relative:page;v-text-anchor:top" o:gfxdata="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" filled="f" stroked="f">
               <v:textbox inset="0,0,0,0">
                 <w:txbxContent>
                   <w:p>
@@ -4144,7 +2878,7 @@
         </mc:Choice>
         <mc:Fallback>
           <w:pict>
-            <v:shape w14:anchorId="0F2EB239" id="Textbox 28" o:spid="_x0000_s1031" type="#_x0000_t202" style="position:absolute;margin-left:69.6pt;margin-top:63.95pt;width:455.7pt;height:25.85pt;z-index:-251662848;visibility:visible;mso-wrap-style:square;mso-wrap-distance-left:0;mso-wrap-distance-top:0;mso-wrap-distance-right:0;mso-wrap-distance-bottom:0;mso-position-horizontal:absolute;mso-position-horizontal-relative:page;mso-position-vertical:absolute;mso-position-vertical-relative:page;v-text-anchor:top" o:gfxdata="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" filled="f" stroked="f">
+            <v:shape w14:anchorId="0F2EB239" id="Textbox 28" o:spid="_x0000_s1028" type="#_x0000_t202" style="position:absolute;margin-left:69.6pt;margin-top:63.95pt;width:455.7pt;height:25.85pt;z-index:-251662848;visibility:visible;mso-wrap-style:square;mso-wrap-distance-left:0;mso-wrap-distance-top:0;mso-wrap-distance-right:0;mso-wrap-distance-bottom:0;mso-position-horizontal:absolute;mso-position-horizontal-relative:page;mso-position-vertical:absolute;mso-position-vertical-relative:page;v-text-anchor:top" o:gfxdata="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" filled="f" stroked="f">
               <v:textbox inset="0,0,0,0">
                 <w:txbxContent>
                   <w:p>

</xml_diff>

<commit_message>
Implementación de campo HORAS en plantilla y lógica. También se cambió el guardado de documentos en caché y su limpieza
</commit_message>
<xml_diff>
--- a/MAQUIRENTAPP/app/src/main/assets/plantilla_cotizacion.docx
+++ b/MAQUIRENTAPP/app/src/main/assets/plantilla_cotizacion.docx
@@ -892,7 +892,10 @@
               <w:t xml:space="preserve"> </w:t>
             </w:r>
             <w:r>
-              <w:t xml:space="preserve">200 </w:t>
+              <w:t>{{HORAS}}</w:t>
+            </w:r>
+            <w:r>
+              <w:t xml:space="preserve"> </w:t>
             </w:r>
             <w:r>
               <w:rPr>
@@ -1307,7 +1310,19 @@
         <w:rPr>
           <w:sz w:val="20"/>
         </w:rPr>
-        <w:t>TARIFA SE APLICA CON HORAS MÍNIMAS DE 200 HORAS MENSUALES, EXCESOS SE FACTURARÁN SEGÚN HORÓMETRO.</w:t>
+        <w:t xml:space="preserve">TARIFA SE APLICA CON HORAS MÍNIMAS DE </w:t>
+      </w:r>
+      <w:r>
+        <w:rPr>
+          <w:sz w:val="20"/>
+        </w:rPr>
+        <w:t>{{HORAS}}</w:t>
+      </w:r>
+      <w:r>
+        <w:rPr>
+          <w:sz w:val="20"/>
+        </w:rPr>
+        <w:t xml:space="preserve"> HORAS MENSUALES, EXCESOS SE FACTURARÁN SEGÚN HORÓMETRO.</w:t>
       </w:r>
     </w:p>
     <w:p>

</xml_diff>

<commit_message>
Plantilla Word de cotización actualizada
</commit_message>
<xml_diff>
--- a/MAQUIRENTAPP/app/src/main/assets/plantilla_cotizacion.docx
+++ b/MAQUIRENTAPP/app/src/main/assets/plantilla_cotizacion.docx
@@ -172,6 +172,7 @@
         <w:rPr>
           <w:rFonts w:ascii="Calibri"/>
           <w:b/>
+          <w:spacing w:val="-2"/>
         </w:rPr>
       </w:pPr>
       <w:r>
@@ -227,6 +228,16 @@
         </w:rPr>
         <w:t>{{LUGAR_TRABAJO}}</w:t>
       </w:r>
+    </w:p>
+    <w:p>
+      <w:pPr>
+        <w:spacing w:before="268"/>
+        <w:ind w:left="1052"/>
+        <w:rPr>
+          <w:rFonts w:ascii="Calibri"/>
+          <w:b/>
+        </w:rPr>
+      </w:pPr>
     </w:p>
     <w:p>
       <w:pPr>
@@ -956,6 +967,60 @@
     </w:p>
     <w:p>
       <w:pPr>
+        <w:pStyle w:val="Textoindependiente"/>
+        <w:spacing w:before="192"/>
+        <w:rPr>
+          <w:sz w:val="22"/>
+        </w:rPr>
+      </w:pPr>
+    </w:p>
+    <w:p>
+      <w:pPr>
+        <w:pStyle w:val="Textoindependiente"/>
+        <w:spacing w:before="192"/>
+        <w:rPr>
+          <w:sz w:val="22"/>
+        </w:rPr>
+      </w:pPr>
+    </w:p>
+    <w:p>
+      <w:pPr>
+        <w:pStyle w:val="Textoindependiente"/>
+        <w:spacing w:before="192"/>
+        <w:rPr>
+          <w:sz w:val="22"/>
+        </w:rPr>
+      </w:pPr>
+    </w:p>
+    <w:p>
+      <w:pPr>
+        <w:pStyle w:val="Textoindependiente"/>
+        <w:spacing w:before="192"/>
+        <w:rPr>
+          <w:sz w:val="22"/>
+        </w:rPr>
+      </w:pPr>
+    </w:p>
+    <w:p>
+      <w:pPr>
+        <w:pStyle w:val="Textoindependiente"/>
+        <w:spacing w:before="192"/>
+        <w:rPr>
+          <w:sz w:val="22"/>
+        </w:rPr>
+      </w:pPr>
+    </w:p>
+    <w:p>
+      <w:pPr>
+        <w:pStyle w:val="Textoindependiente"/>
+        <w:spacing w:before="192"/>
+        <w:rPr>
+          <w:sz w:val="22"/>
+        </w:rPr>
+      </w:pPr>
+    </w:p>
+    <w:p>
+      <w:pPr>
         <w:pStyle w:val="Ttulo1"/>
         <w:spacing w:before="1" w:line="240" w:lineRule="auto"/>
         <w:ind w:left="1052"/>
@@ -1502,14 +1567,7 @@
         <w:rPr>
           <w:sz w:val="20"/>
         </w:rPr>
-        <w:t xml:space="preserve">EN CASO DE PRESENTARSE CUALQUIER DAÑO, EL CLIENTE SE HARÁ RESPONSABLE DE LAS </w:t>
-      </w:r>
-      <w:r>
-        <w:rPr>
-          <w:sz w:val="20"/>
-        </w:rPr>
-        <w:lastRenderedPageBreak/>
-        <w:t>REPARACIONES, SEGÚN LOS CARGOS POR DAÑOS VIGENTES A LA DEVOLUCIÓN.</w:t>
+        <w:t>EN CASO DE PRESENTARSE CUALQUIER DAÑO, EL CLIENTE SE HARÁ RESPONSABLE DE LAS REPARACIONES, SEGÚN LOS CARGOS POR DAÑOS VIGENTES A LA DEVOLUCIÓN.</w:t>
       </w:r>
     </w:p>
     <w:p>
@@ -1944,13 +2002,114 @@
     </w:p>
     <w:p>
       <w:pPr>
+        <w:pStyle w:val="Prrafodelista"/>
+        <w:numPr>
+          <w:ilvl w:val="0"/>
+          <w:numId w:val="1"/>
+        </w:numPr>
+        <w:tabs>
+          <w:tab w:val="left" w:pos="1762"/>
+          <w:tab w:val="left" w:pos="1764"/>
+        </w:tabs>
+        <w:spacing w:before="7" w:line="235" w:lineRule="auto"/>
+        <w:ind w:right="1055"/>
+        <w:rPr>
+          <w:bCs/>
+          <w:sz w:val="20"/>
+        </w:rPr>
+      </w:pPr>
+      <w:r>
+        <w:rPr>
+          <w:bCs/>
+          <w:spacing w:val="-2"/>
+          <w:sz w:val="20"/>
+        </w:rPr>
+        <w:t>LA PRESENTE COTIZACIÓN TIENE UNA VALIDEZ DE 15 DÍAS DESDE SU CREACIÓN.</w:t>
+      </w:r>
+    </w:p>
+    <w:p>
+      <w:pPr>
         <w:tabs>
           <w:tab w:val="left" w:pos="7086"/>
         </w:tabs>
       </w:pPr>
     </w:p>
+    <w:p>
+      <w:pPr>
+        <w:tabs>
+          <w:tab w:val="left" w:pos="7086"/>
+        </w:tabs>
+      </w:pPr>
+    </w:p>
+    <w:p>
+      <w:pPr>
+        <w:tabs>
+          <w:tab w:val="left" w:pos="7086"/>
+        </w:tabs>
+      </w:pPr>
+      <w:r>
+        <w:rPr>
+          <w:noProof/>
+        </w:rPr>
+        <w:drawing>
+          <wp:anchor distT="0" distB="0" distL="114300" distR="114300" simplePos="0" relativeHeight="251658240" behindDoc="0" locked="0" layoutInCell="1" allowOverlap="1" wp14:anchorId="511924E9" wp14:editId="2D6AA0E3">
+            <wp:simplePos x="0" y="0"/>
+            <wp:positionH relativeFrom="column">
+              <wp:posOffset>5046247</wp:posOffset>
+            </wp:positionH>
+            <wp:positionV relativeFrom="paragraph">
+              <wp:posOffset>441325</wp:posOffset>
+            </wp:positionV>
+            <wp:extent cx="1617345" cy="1087120"/>
+            <wp:effectExtent l="0" t="0" r="0" b="0"/>
+            <wp:wrapSquare wrapText="bothSides"/>
+            <wp:docPr id="2" name="Imagen 2" descr="Texto&#10;&#10;El contenido generado por IA puede ser incorrecto."/>
+            <wp:cNvGraphicFramePr>
+              <a:graphicFrameLocks xmlns:a="http://schemas.openxmlformats.org/drawingml/2006/main" noChangeAspect="1"/>
+            </wp:cNvGraphicFramePr>
+            <a:graphic xmlns:a="http://schemas.openxmlformats.org/drawingml/2006/main">
+              <a:graphicData uri="http://schemas.openxmlformats.org/drawingml/2006/picture">
+                <pic:pic xmlns:pic="http://schemas.openxmlformats.org/drawingml/2006/picture">
+                  <pic:nvPicPr>
+                    <pic:cNvPr id="2" name="Imagen 2" descr="Texto&#10;&#10;El contenido generado por IA puede ser incorrecto."/>
+                    <pic:cNvPicPr/>
+                  </pic:nvPicPr>
+                  <pic:blipFill>
+                    <a:blip r:embed="rId7">
+                      <a:extLst>
+                        <a:ext uri="{28A0092B-C50C-407E-A947-70E740481C1C}">
+                          <a14:useLocalDpi xmlns:a14="http://schemas.microsoft.com/office/drawing/2010/main" val="0"/>
+                        </a:ext>
+                      </a:extLst>
+                    </a:blip>
+                    <a:stretch>
+                      <a:fillRect/>
+                    </a:stretch>
+                  </pic:blipFill>
+                  <pic:spPr>
+                    <a:xfrm>
+                      <a:off x="0" y="0"/>
+                      <a:ext cx="1617345" cy="1087120"/>
+                    </a:xfrm>
+                    <a:prstGeom prst="rect">
+                      <a:avLst/>
+                    </a:prstGeom>
+                  </pic:spPr>
+                </pic:pic>
+              </a:graphicData>
+            </a:graphic>
+            <wp14:sizeRelH relativeFrom="margin">
+              <wp14:pctWidth>0</wp14:pctWidth>
+            </wp14:sizeRelH>
+            <wp14:sizeRelV relativeFrom="margin">
+              <wp14:pctHeight>0</wp14:pctHeight>
+            </wp14:sizeRelV>
+          </wp:anchor>
+        </w:drawing>
+      </w:r>
+    </w:p>
     <w:sectPr>
-      <w:headerReference w:type="default" r:id="rId7"/>
+      <w:headerReference w:type="default" r:id="rId8"/>
       <w:pgSz w:w="12240" w:h="15840"/>
       <w:pgMar w:top="2040" w:right="360" w:bottom="280" w:left="360" w:header="759" w:footer="0" w:gutter="0"/>
       <w:cols w:space="720"/>

</xml_diff>